<commit_message>
Added the API XHR Example files.
</commit_message>
<xml_diff>
--- a/Notes/Audit Logging with SERILOG.docx
+++ b/Notes/Audit Logging with SERILOG.docx
@@ -464,7 +464,6 @@
         </w:rPr>
       </w:pPr>
       <w:proofErr w:type="spellStart"/>
-      <w:proofErr w:type="gramStart"/>
       <w:r>
         <w:rPr>
           <w:b/>
@@ -473,7 +472,6 @@
         <w:t>Serilog.Settings.Configuration</w:t>
       </w:r>
       <w:proofErr w:type="spellEnd"/>
-      <w:proofErr w:type="gramEnd"/>
       <w:r>
         <w:rPr>
           <w:b/>
@@ -501,7 +499,6 @@
         </w:numPr>
       </w:pPr>
       <w:proofErr w:type="spellStart"/>
-      <w:proofErr w:type="gramStart"/>
       <w:r>
         <w:rPr>
           <w:b/>
@@ -510,7 +507,6 @@
         <w:t>Serilog.Enrichers.Environment</w:t>
       </w:r>
       <w:proofErr w:type="spellEnd"/>
-      <w:proofErr w:type="gramEnd"/>
       <w:r>
         <w:tab/>
       </w:r>
@@ -534,7 +530,6 @@
         </w:rPr>
       </w:pPr>
       <w:proofErr w:type="spellStart"/>
-      <w:proofErr w:type="gramStart"/>
       <w:r>
         <w:rPr>
           <w:b/>
@@ -543,7 +538,6 @@
         <w:t>Serilog.Enrichers.Thread</w:t>
       </w:r>
       <w:proofErr w:type="spellEnd"/>
-      <w:proofErr w:type="gramEnd"/>
       <w:r>
         <w:rPr>
           <w:b/>
@@ -582,7 +576,6 @@
         </w:rPr>
       </w:pPr>
       <w:proofErr w:type="spellStart"/>
-      <w:proofErr w:type="gramStart"/>
       <w:r>
         <w:rPr>
           <w:b/>
@@ -591,7 +584,6 @@
         <w:t>Serilog.Enrichers.Process</w:t>
       </w:r>
       <w:proofErr w:type="spellEnd"/>
-      <w:proofErr w:type="gramEnd"/>
       <w:r>
         <w:rPr>
           <w:b/>
@@ -630,7 +622,6 @@
         </w:rPr>
       </w:pPr>
       <w:proofErr w:type="spellStart"/>
-      <w:proofErr w:type="gramStart"/>
       <w:r>
         <w:rPr>
           <w:b/>
@@ -639,7 +630,6 @@
         <w:t>Serilog.Enrichers.CorrelationId</w:t>
       </w:r>
       <w:proofErr w:type="spellEnd"/>
-      <w:proofErr w:type="gramEnd"/>
       <w:r>
         <w:rPr>
           <w:b/>
@@ -671,7 +661,6 @@
         </w:rPr>
       </w:pPr>
       <w:proofErr w:type="spellStart"/>
-      <w:proofErr w:type="gramStart"/>
       <w:r>
         <w:rPr>
           <w:b/>
@@ -680,7 +669,6 @@
         <w:t>Serilog.Sinks.Seq</w:t>
       </w:r>
       <w:proofErr w:type="spellEnd"/>
-      <w:proofErr w:type="gramEnd"/>
       <w:r>
         <w:rPr>
           <w:b/>
@@ -727,7 +715,6 @@
         </w:numPr>
       </w:pPr>
       <w:proofErr w:type="spellStart"/>
-      <w:proofErr w:type="gramStart"/>
       <w:r>
         <w:rPr>
           <w:b/>
@@ -736,7 +723,6 @@
         <w:t>Serilog.Sinks.Console</w:t>
       </w:r>
       <w:proofErr w:type="spellEnd"/>
-      <w:proofErr w:type="gramEnd"/>
       <w:r>
         <w:rPr>
           <w:b/>
@@ -774,7 +760,6 @@
         </w:numPr>
       </w:pPr>
       <w:proofErr w:type="spellStart"/>
-      <w:proofErr w:type="gramStart"/>
       <w:r>
         <w:rPr>
           <w:b/>
@@ -783,7 +768,6 @@
         <w:t>Serilog.Sinks.File</w:t>
       </w:r>
       <w:proofErr w:type="spellEnd"/>
-      <w:proofErr w:type="gramEnd"/>
       <w:r>
         <w:tab/>
       </w:r>
@@ -816,7 +800,6 @@
         </w:rPr>
       </w:pPr>
       <w:proofErr w:type="spellStart"/>
-      <w:proofErr w:type="gramStart"/>
       <w:r>
         <w:rPr>
           <w:b/>
@@ -825,7 +808,6 @@
         <w:t>Serilog.Sinks.MSSqlServer</w:t>
       </w:r>
       <w:proofErr w:type="spellEnd"/>
-      <w:proofErr w:type="gramEnd"/>
       <w:r>
         <w:rPr>
           <w:b/>
@@ -1104,12 +1086,10 @@
         <w:t xml:space="preserve">dotnet add package </w:t>
       </w:r>
       <w:proofErr w:type="spellStart"/>
-      <w:proofErr w:type="gramStart"/>
       <w:r>
         <w:t>Serilog.Sinks.Seq</w:t>
       </w:r>
       <w:proofErr w:type="spellEnd"/>
-      <w:proofErr w:type="gramEnd"/>
     </w:p>
     <w:p>
       <w:r>
@@ -1154,34 +1134,20 @@
       </w:r>
       <w:proofErr w:type="spellEnd"/>
       <w:r>
-        <w:t xml:space="preserve">": </w:t>
-      </w:r>
-      <w:proofErr w:type="gramStart"/>
-      <w:r>
-        <w:t>{ "</w:t>
-      </w:r>
-      <w:proofErr w:type="spellStart"/>
-      <w:proofErr w:type="gramEnd"/>
+        <w:t>": { "</w:t>
+      </w:r>
+      <w:proofErr w:type="spellStart"/>
       <w:r>
         <w:t>serverUrl</w:t>
       </w:r>
       <w:proofErr w:type="spellEnd"/>
       <w:r>
-        <w:t>": "http://localhost:5341</w:t>
-      </w:r>
-      <w:proofErr w:type="gramStart"/>
-      <w:r>
-        <w:t>" }</w:t>
-      </w:r>
-      <w:proofErr w:type="gramEnd"/>
-      <w:r>
-        <w:br/>
-      </w:r>
-      <w:proofErr w:type="gramStart"/>
-      <w:r>
+        <w:t>": "http://localhost:5341" }</w:t>
+      </w:r>
+      <w:r>
+        <w:br/>
         <w:t xml:space="preserve">  }</w:t>
       </w:r>
-      <w:proofErr w:type="gramEnd"/>
       <w:r>
         <w:br/>
         <w:t>]</w:t>
@@ -1323,12 +1289,10 @@
         <w:t>dbo</w:t>
       </w:r>
       <w:proofErr w:type="spellEnd"/>
-      <w:proofErr w:type="gramStart"/>
       <w:r>
         <w:t>].[</w:t>
       </w:r>
       <w:proofErr w:type="spellStart"/>
-      <w:proofErr w:type="gramEnd"/>
       <w:r>
         <w:t>ApiLogs</w:t>
       </w:r>
@@ -1352,15 +1316,7 @@
         <w:spacing w:before="80" w:after="80"/>
       </w:pPr>
       <w:r>
-        <w:t xml:space="preserve">    [Id] INT </w:t>
-      </w:r>
-      <w:proofErr w:type="gramStart"/>
-      <w:r>
-        <w:t>IDENTITY(</w:t>
-      </w:r>
-      <w:proofErr w:type="gramEnd"/>
-      <w:r>
-        <w:t>1,1) NOT NULL PRIMARY KEY,</w:t>
+        <w:t xml:space="preserve">    [Id] INT IDENTITY(1,1) NOT NULL PRIMARY KEY,</w:t>
       </w:r>
     </w:p>
     <w:p>
@@ -1395,15 +1351,7 @@
         <w:spacing w:before="80" w:after="80"/>
       </w:pPr>
       <w:r>
-        <w:t xml:space="preserve">    [Level] </w:t>
-      </w:r>
-      <w:proofErr w:type="gramStart"/>
-      <w:r>
-        <w:t>NVARCHAR(</w:t>
-      </w:r>
-      <w:proofErr w:type="gramEnd"/>
-      <w:r>
-        <w:t>128) NULL,</w:t>
+        <w:t xml:space="preserve">    [Level] NVARCHAR(128) NULL,</w:t>
       </w:r>
     </w:p>
     <w:p>
@@ -1420,15 +1368,7 @@
       </w:r>
       <w:proofErr w:type="spellEnd"/>
       <w:r>
-        <w:t xml:space="preserve">] </w:t>
-      </w:r>
-      <w:proofErr w:type="gramStart"/>
-      <w:r>
-        <w:t>DATETIMEOFFSET(</w:t>
-      </w:r>
-      <w:proofErr w:type="gramEnd"/>
-      <w:r>
-        <w:t>7) NOT NULL,</w:t>
+        <w:t>] DATETIMEOFFSET(7) NOT NULL,</w:t>
       </w:r>
     </w:p>
     <w:p>
@@ -1471,11 +1411,9 @@
         <w:pStyle w:val="code"/>
         <w:spacing w:before="80" w:after="80"/>
       </w:pPr>
-      <w:proofErr w:type="gramStart"/>
       <w:r>
         <w:t>);</w:t>
       </w:r>
-      <w:proofErr w:type="gramEnd"/>
     </w:p>
     <w:p>
       <w:pPr>
@@ -1500,12 +1438,10 @@
         <w:t xml:space="preserve"> ON </w:t>
       </w:r>
       <w:proofErr w:type="spellStart"/>
-      <w:proofErr w:type="gramStart"/>
       <w:r>
         <w:t>dbo.ApiLogs</w:t>
       </w:r>
       <w:proofErr w:type="spellEnd"/>
-      <w:proofErr w:type="gramEnd"/>
       <w:r>
         <w:t>(</w:t>
       </w:r>
@@ -1514,11 +1450,9 @@
         <w:t>TimeStamp</w:t>
       </w:r>
       <w:proofErr w:type="spellEnd"/>
-      <w:proofErr w:type="gramStart"/>
       <w:r>
         <w:t>);</w:t>
       </w:r>
-      <w:proofErr w:type="gramEnd"/>
     </w:p>
     <w:p>
       <w:pPr>
@@ -1537,20 +1471,13 @@
         <w:t xml:space="preserve"> ON </w:t>
       </w:r>
       <w:proofErr w:type="spellStart"/>
-      <w:proofErr w:type="gramStart"/>
       <w:r>
         <w:t>dbo.ApiLogs</w:t>
       </w:r>
       <w:proofErr w:type="spellEnd"/>
-      <w:proofErr w:type="gramEnd"/>
-      <w:r>
-        <w:t>(Level</w:t>
-      </w:r>
-      <w:proofErr w:type="gramStart"/>
-      <w:r>
-        <w:t>);</w:t>
-      </w:r>
-      <w:proofErr w:type="gramEnd"/>
+      <w:r>
+        <w:t>(Level);</w:t>
+      </w:r>
     </w:p>
     <w:p>
       <w:pPr>
@@ -1675,7 +1602,6 @@
         <w:t xml:space="preserve"> Step 2 — Update </w:t>
       </w:r>
       <w:proofErr w:type="spellStart"/>
-      <w:proofErr w:type="gramStart"/>
       <w:r>
         <w:rPr>
           <w:b/>
@@ -1684,7 +1610,6 @@
         <w:t>appsettings.json</w:t>
       </w:r>
       <w:proofErr w:type="spellEnd"/>
-      <w:proofErr w:type="gramEnd"/>
     </w:p>
     <w:p>
       <w:r>
@@ -2256,7 +2181,6 @@
         <w:t xml:space="preserve">using </w:t>
       </w:r>
       <w:proofErr w:type="spellStart"/>
-      <w:proofErr w:type="gramStart"/>
       <w:r>
         <w:t>Serilog</w:t>
       </w:r>
@@ -2264,21 +2188,29 @@
       <w:r>
         <w:t>;</w:t>
       </w:r>
-      <w:proofErr w:type="gramEnd"/>
     </w:p>
     <w:p>
       <w:r>
         <w:t xml:space="preserve">Before </w:t>
       </w:r>
       <w:proofErr w:type="spellStart"/>
-      <w:proofErr w:type="gramStart"/>
-      <w:r>
+      <w:r>
+        <w:rPr>
+          <w:b/>
+          <w:bCs/>
+        </w:rPr>
         <w:t>builder.Build</w:t>
       </w:r>
       <w:proofErr w:type="spellEnd"/>
-      <w:proofErr w:type="gramEnd"/>
-      <w:r>
-        <w:t>():</w:t>
+      <w:r>
+        <w:rPr>
+          <w:b/>
+          <w:bCs/>
+        </w:rPr>
+        <w:t>()</w:t>
+      </w:r>
+      <w:r>
+        <w:t>:</w:t>
       </w:r>
     </w:p>
     <w:p>
@@ -2294,7 +2226,6 @@
         </w:rPr>
       </w:pPr>
       <w:proofErr w:type="spellStart"/>
-      <w:proofErr w:type="gramStart"/>
       <w:r>
         <w:rPr>
           <w:color w:val="F1A983" w:themeColor="accent2" w:themeTint="99"/>
@@ -2302,164 +2233,118 @@
         <w:t>builder.Logging.ClearProviders</w:t>
       </w:r>
       <w:proofErr w:type="spellEnd"/>
-      <w:proofErr w:type="gramEnd"/>
       <w:r>
         <w:rPr>
           <w:color w:val="F1A983" w:themeColor="accent2" w:themeTint="99"/>
         </w:rPr>
+        <w:t>();</w:t>
+      </w:r>
+    </w:p>
+    <w:p>
+      <w:pPr>
+        <w:pStyle w:val="code"/>
+        <w:rPr>
+          <w:color w:val="F1A983" w:themeColor="accent2" w:themeTint="99"/>
+        </w:rPr>
+      </w:pPr>
+      <w:proofErr w:type="spellStart"/>
+      <w:r>
+        <w:rPr>
+          <w:color w:val="F1A983" w:themeColor="accent2" w:themeTint="99"/>
+        </w:rPr>
+        <w:t>builder.Logging.AddConsole</w:t>
+      </w:r>
+      <w:proofErr w:type="spellEnd"/>
+      <w:r>
+        <w:rPr>
+          <w:color w:val="F1A983" w:themeColor="accent2" w:themeTint="99"/>
+        </w:rPr>
+        <w:t>();</w:t>
+      </w:r>
+    </w:p>
+    <w:p>
+      <w:pPr>
+        <w:pStyle w:val="code"/>
+        <w:rPr>
+          <w:color w:val="F1A983" w:themeColor="accent2" w:themeTint="99"/>
+        </w:rPr>
+      </w:pPr>
+      <w:proofErr w:type="spellStart"/>
+      <w:r>
+        <w:rPr>
+          <w:color w:val="F1A983" w:themeColor="accent2" w:themeTint="99"/>
+        </w:rPr>
+        <w:t>builder.Logging.AddDebug</w:t>
+      </w:r>
+      <w:proofErr w:type="spellEnd"/>
+      <w:r>
+        <w:rPr>
+          <w:color w:val="F1A983" w:themeColor="accent2" w:themeTint="99"/>
+        </w:rPr>
+        <w:t>();</w:t>
+      </w:r>
+    </w:p>
+    <w:p>
+      <w:r>
+        <w:t>Register</w:t>
+      </w:r>
+      <w:r>
+        <w:t xml:space="preserve"> and configure </w:t>
+      </w:r>
+      <w:proofErr w:type="spellStart"/>
+      <w:r>
+        <w:t>Serilog</w:t>
+      </w:r>
+      <w:proofErr w:type="spellEnd"/>
+      <w:r>
+        <w:t>:</w:t>
+      </w:r>
+    </w:p>
+    <w:p>
+      <w:pPr>
+        <w:pStyle w:val="code"/>
+      </w:pPr>
+      <w:proofErr w:type="spellStart"/>
+      <w:r>
+        <w:t>Log.Logger</w:t>
+      </w:r>
+      <w:proofErr w:type="spellEnd"/>
+      <w:r>
+        <w:t xml:space="preserve"> = new </w:t>
+      </w:r>
+      <w:proofErr w:type="spellStart"/>
+      <w:r>
+        <w:t>LoggerConfiguration</w:t>
+      </w:r>
+      <w:proofErr w:type="spellEnd"/>
+      <w:r>
+        <w:t>()</w:t>
+      </w:r>
+      <w:r>
+        <w:br/>
+        <w:t xml:space="preserve">    .</w:t>
+      </w:r>
+      <w:proofErr w:type="spellStart"/>
+      <w:r>
+        <w:t>ReadFrom.Configuration</w:t>
+      </w:r>
+      <w:proofErr w:type="spellEnd"/>
+      <w:r>
         <w:t>(</w:t>
       </w:r>
-      <w:proofErr w:type="gramStart"/>
-      <w:r>
-        <w:rPr>
-          <w:color w:val="F1A983" w:themeColor="accent2" w:themeTint="99"/>
-        </w:rPr>
-        <w:t>);</w:t>
-      </w:r>
-      <w:proofErr w:type="gramEnd"/>
-    </w:p>
-    <w:p>
-      <w:pPr>
-        <w:pStyle w:val="code"/>
-        <w:rPr>
-          <w:color w:val="F1A983" w:themeColor="accent2" w:themeTint="99"/>
-        </w:rPr>
-      </w:pPr>
-      <w:proofErr w:type="spellStart"/>
-      <w:proofErr w:type="gramStart"/>
-      <w:r>
-        <w:rPr>
-          <w:color w:val="F1A983" w:themeColor="accent2" w:themeTint="99"/>
-        </w:rPr>
-        <w:t>builder.Logging.AddConsole</w:t>
-      </w:r>
-      <w:proofErr w:type="spellEnd"/>
-      <w:proofErr w:type="gramEnd"/>
-      <w:r>
-        <w:rPr>
-          <w:color w:val="F1A983" w:themeColor="accent2" w:themeTint="99"/>
-        </w:rPr>
-        <w:t>(</w:t>
-      </w:r>
-      <w:proofErr w:type="gramStart"/>
-      <w:r>
-        <w:rPr>
-          <w:color w:val="F1A983" w:themeColor="accent2" w:themeTint="99"/>
-        </w:rPr>
-        <w:t>);</w:t>
-      </w:r>
-      <w:proofErr w:type="gramEnd"/>
-    </w:p>
-    <w:p>
-      <w:pPr>
-        <w:pStyle w:val="code"/>
-        <w:rPr>
-          <w:color w:val="F1A983" w:themeColor="accent2" w:themeTint="99"/>
-        </w:rPr>
-      </w:pPr>
-      <w:proofErr w:type="spellStart"/>
-      <w:proofErr w:type="gramStart"/>
-      <w:r>
-        <w:rPr>
-          <w:color w:val="F1A983" w:themeColor="accent2" w:themeTint="99"/>
-        </w:rPr>
-        <w:t>builder.Logging.AddDebug</w:t>
-      </w:r>
-      <w:proofErr w:type="spellEnd"/>
-      <w:proofErr w:type="gramEnd"/>
-      <w:r>
-        <w:rPr>
-          <w:color w:val="F1A983" w:themeColor="accent2" w:themeTint="99"/>
-        </w:rPr>
-        <w:t>(</w:t>
-      </w:r>
-      <w:proofErr w:type="gramStart"/>
-      <w:r>
-        <w:rPr>
-          <w:color w:val="F1A983" w:themeColor="accent2" w:themeTint="99"/>
-        </w:rPr>
-        <w:t>);</w:t>
-      </w:r>
-      <w:proofErr w:type="gramEnd"/>
-    </w:p>
-    <w:p>
-      <w:r>
-        <w:t>Register</w:t>
-      </w:r>
-      <w:r>
-        <w:t xml:space="preserve"> and configure </w:t>
-      </w:r>
-      <w:proofErr w:type="spellStart"/>
-      <w:r>
-        <w:t>Serilog</w:t>
-      </w:r>
-      <w:proofErr w:type="spellEnd"/>
-      <w:r>
-        <w:t>:</w:t>
-      </w:r>
-    </w:p>
-    <w:p>
-      <w:pPr>
-        <w:pStyle w:val="code"/>
-      </w:pPr>
-      <w:proofErr w:type="spellStart"/>
-      <w:r>
-        <w:t>Log.Logger</w:t>
-      </w:r>
-      <w:proofErr w:type="spellEnd"/>
-      <w:r>
-        <w:t xml:space="preserve"> = new </w:t>
-      </w:r>
-      <w:proofErr w:type="spellStart"/>
-      <w:proofErr w:type="gramStart"/>
-      <w:r>
-        <w:t>LoggerConfiguration</w:t>
-      </w:r>
-      <w:proofErr w:type="spellEnd"/>
-      <w:r>
-        <w:t>(</w:t>
-      </w:r>
-      <w:proofErr w:type="gramEnd"/>
+      <w:proofErr w:type="spellStart"/>
+      <w:r>
+        <w:t>builder.Configuration</w:t>
+      </w:r>
+      <w:proofErr w:type="spellEnd"/>
       <w:r>
         <w:t>)</w:t>
       </w:r>
       <w:r>
         <w:br/>
-        <w:t xml:space="preserve">  </w:t>
-      </w:r>
-      <w:proofErr w:type="gramStart"/>
-      <w:r>
-        <w:t xml:space="preserve">  .</w:t>
-      </w:r>
-      <w:proofErr w:type="spellStart"/>
-      <w:proofErr w:type="gramEnd"/>
-      <w:r>
-        <w:t>ReadFrom.Configuration</w:t>
-      </w:r>
-      <w:proofErr w:type="spellEnd"/>
-      <w:r>
-        <w:t>(</w:t>
-      </w:r>
-      <w:proofErr w:type="spellStart"/>
-      <w:proofErr w:type="gramStart"/>
-      <w:r>
-        <w:t>builder.Configuration</w:t>
-      </w:r>
-      <w:proofErr w:type="spellEnd"/>
-      <w:proofErr w:type="gramEnd"/>
-      <w:r>
-        <w:t>)</w:t>
-      </w:r>
-      <w:r>
-        <w:br/>
-        <w:t xml:space="preserve">  </w:t>
-      </w:r>
-      <w:proofErr w:type="gramStart"/>
-      <w:r>
-        <w:t xml:space="preserve">  .</w:t>
-      </w:r>
-      <w:proofErr w:type="spellStart"/>
-      <w:proofErr w:type="gramEnd"/>
+        <w:t xml:space="preserve">    .</w:t>
+      </w:r>
+      <w:proofErr w:type="spellStart"/>
       <w:r>
         <w:t>Enrich.FromLogContext</w:t>
       </w:r>
@@ -2469,18 +2354,13 @@
       </w:r>
       <w:r>
         <w:br/>
-        <w:t xml:space="preserve">  </w:t>
-      </w:r>
-      <w:proofErr w:type="gramStart"/>
-      <w:r>
-        <w:t xml:space="preserve">  .</w:t>
+        <w:t xml:space="preserve">    .</w:t>
       </w:r>
       <w:proofErr w:type="spellStart"/>
       <w:r>
         <w:t>CreateLogger</w:t>
       </w:r>
       <w:proofErr w:type="spellEnd"/>
-      <w:proofErr w:type="gramEnd"/>
       <w:r>
         <w:t>();</w:t>
       </w:r>
@@ -2491,20 +2371,13 @@
         <w:br/>
       </w:r>
       <w:proofErr w:type="spellStart"/>
-      <w:proofErr w:type="gramStart"/>
       <w:r>
         <w:t>builder.Host.UseSerilog</w:t>
       </w:r>
       <w:proofErr w:type="spellEnd"/>
-      <w:proofErr w:type="gramEnd"/>
-      <w:r>
-        <w:t>(</w:t>
-      </w:r>
-      <w:proofErr w:type="gramStart"/>
-      <w:r>
-        <w:t>);</w:t>
-      </w:r>
-      <w:proofErr w:type="gramEnd"/>
+      <w:r>
+        <w:t>();</w:t>
+      </w:r>
     </w:p>
     <w:p>
       <w:r>
@@ -2537,12 +2410,10 @@
         </w:rPr>
       </w:pPr>
       <w:proofErr w:type="spellStart"/>
-      <w:proofErr w:type="gramStart"/>
       <w:r>
         <w:t>app.UseSerilogRequestLogging</w:t>
       </w:r>
       <w:proofErr w:type="spellEnd"/>
-      <w:proofErr w:type="gramEnd"/>
       <w:r>
         <w:t>();</w:t>
       </w:r>
@@ -2550,7 +2421,6 @@
         <w:br/>
       </w:r>
       <w:proofErr w:type="spellStart"/>
-      <w:proofErr w:type="gramStart"/>
       <w:r>
         <w:rPr>
           <w:b w:val="0"/>
@@ -2559,7 +2429,6 @@
         <w:t>app.UseHttpsRedirection</w:t>
       </w:r>
       <w:proofErr w:type="spellEnd"/>
-      <w:proofErr w:type="gramEnd"/>
       <w:r>
         <w:rPr>
           <w:b w:val="0"/>
@@ -2880,12 +2749,10 @@
         <w:pStyle w:val="code"/>
       </w:pPr>
       <w:proofErr w:type="spellStart"/>
-      <w:proofErr w:type="gramStart"/>
       <w:r>
         <w:t>app.Use</w:t>
       </w:r>
       <w:proofErr w:type="spellEnd"/>
-      <w:proofErr w:type="gramEnd"/>
       <w:r>
         <w:t>(async (context, next) =&gt;</w:t>
       </w:r>
@@ -2906,12 +2773,10 @@
         <w:t xml:space="preserve"> = </w:t>
       </w:r>
       <w:proofErr w:type="spellStart"/>
-      <w:proofErr w:type="gramStart"/>
       <w:r>
         <w:t>context.TraceIdentifier</w:t>
       </w:r>
       <w:proofErr w:type="spellEnd"/>
-      <w:proofErr w:type="gramEnd"/>
       <w:r>
         <w:t>;</w:t>
       </w:r>
@@ -2923,12 +2788,10 @@
         <w:t xml:space="preserve">    using (</w:t>
       </w:r>
       <w:proofErr w:type="spellStart"/>
-      <w:proofErr w:type="gramStart"/>
       <w:r>
         <w:t>Serilog.Context.LogContext.PushProperty</w:t>
       </w:r>
       <w:proofErr w:type="spellEnd"/>
-      <w:proofErr w:type="gramEnd"/>
       <w:r>
         <w:t>(</w:t>
       </w:r>
@@ -2962,50 +2825,26 @@
       </w:r>
       <w:r>
         <w:br/>
-        <w:t xml:space="preserve"> </w:t>
-      </w:r>
-      <w:proofErr w:type="gramStart"/>
-      <w:r>
-        <w:t xml:space="preserve">   {</w:t>
-      </w:r>
-      <w:proofErr w:type="gramEnd"/>
-      <w:r>
-        <w:br/>
-        <w:t xml:space="preserve">        await </w:t>
-      </w:r>
-      <w:proofErr w:type="gramStart"/>
-      <w:r>
-        <w:t>next(</w:t>
-      </w:r>
-      <w:proofErr w:type="gramEnd"/>
-      <w:r>
-        <w:t>);</w:t>
-      </w:r>
-      <w:r>
-        <w:br/>
-        <w:t xml:space="preserve">  </w:t>
-      </w:r>
-      <w:proofErr w:type="gramStart"/>
-      <w:r>
-        <w:t xml:space="preserve">  }</w:t>
-      </w:r>
-      <w:proofErr w:type="gramEnd"/>
-      <w:r>
-        <w:br/>
-        <w:t>}</w:t>
-      </w:r>
-      <w:proofErr w:type="gramStart"/>
-      <w:r>
-        <w:t>);</w:t>
-      </w:r>
-      <w:proofErr w:type="gramEnd"/>
+        <w:t xml:space="preserve">    {</w:t>
+      </w:r>
+      <w:r>
+        <w:br/>
+        <w:t xml:space="preserve">        await next();</w:t>
+      </w:r>
+      <w:r>
+        <w:br/>
+        <w:t xml:space="preserve">    }</w:t>
+      </w:r>
+      <w:r>
+        <w:br/>
+        <w:t>});</w:t>
+      </w:r>
     </w:p>
     <w:p>
       <w:pPr>
         <w:pStyle w:val="code"/>
       </w:pPr>
       <w:proofErr w:type="spellStart"/>
-      <w:proofErr w:type="gramStart"/>
       <w:r>
         <w:rPr>
           <w:b w:val="0"/>
@@ -3014,7 +2853,6 @@
         <w:t>app.UseSerilogRequestLogging</w:t>
       </w:r>
       <w:proofErr w:type="spellEnd"/>
-      <w:proofErr w:type="gramEnd"/>
       <w:r>
         <w:rPr>
           <w:b w:val="0"/>
@@ -3438,7 +3276,6 @@
         <w:t>_</w:t>
       </w:r>
       <w:proofErr w:type="spellStart"/>
-      <w:proofErr w:type="gramStart"/>
       <w:r>
         <w:rPr>
           <w:b w:val="0"/>
@@ -3447,7 +3284,6 @@
         <w:t>logger.LogInformation</w:t>
       </w:r>
       <w:proofErr w:type="spellEnd"/>
-      <w:proofErr w:type="gramEnd"/>
       <w:r>
         <w:rPr>
           <w:b w:val="0"/>
@@ -3504,7 +3340,6 @@
         <w:t xml:space="preserve">    </w:t>
       </w:r>
       <w:proofErr w:type="spellStart"/>
-      <w:proofErr w:type="gramStart"/>
       <w:r>
         <w:rPr>
           <w:b w:val="0"/>
@@ -3520,7 +3355,6 @@
         </w:rPr>
         <w:t>);</w:t>
       </w:r>
-      <w:proofErr w:type="gramEnd"/>
     </w:p>
     <w:p>
       <w:r>
@@ -3586,12 +3420,10 @@
         <w:t xml:space="preserve">)  configured in </w:t>
       </w:r>
       <w:proofErr w:type="spellStart"/>
-      <w:proofErr w:type="gramStart"/>
       <w:r>
         <w:t>appsettings.json</w:t>
       </w:r>
       <w:proofErr w:type="spellEnd"/>
-      <w:proofErr w:type="gramEnd"/>
     </w:p>
     <w:p>
       <w:r>
@@ -3875,7 +3707,13 @@
       </w:r>
       <w:proofErr w:type="spellEnd"/>
       <w:r>
-        <w:t>/categories'</w:t>
+        <w:t>/categories</w:t>
+      </w:r>
+      <w:r>
+        <w:t>%</w:t>
+      </w:r>
+      <w:r>
+        <w:t>'</w:t>
       </w:r>
     </w:p>
     <w:p>
@@ -4397,27 +4235,17 @@
     </w:p>
     <w:p>
       <w:r>
-        <w:t xml:space="preserve">To check if a </w:t>
-      </w:r>
-      <w:proofErr w:type="gramStart"/>
-      <w:r>
-        <w:t>Property</w:t>
-      </w:r>
-      <w:proofErr w:type="gramEnd"/>
-      <w:r>
-        <w:t xml:space="preserve"> exists:</w:t>
+        <w:t>To check if a Property exists:</w:t>
       </w:r>
     </w:p>
     <w:p>
       <w:pPr>
         <w:pStyle w:val="code"/>
       </w:pPr>
-      <w:proofErr w:type="gramStart"/>
       <w:r>
         <w:t>has(</w:t>
       </w:r>
       <w:proofErr w:type="spellStart"/>
-      <w:proofErr w:type="gramEnd"/>
       <w:r>
         <w:t>CorrelationId</w:t>
       </w:r>
@@ -4430,13 +4258,8 @@
       <w:pPr>
         <w:pStyle w:val="code"/>
       </w:pPr>
-      <w:proofErr w:type="gramStart"/>
-      <w:r>
-        <w:t>has(</w:t>
-      </w:r>
-      <w:proofErr w:type="gramEnd"/>
-      <w:r>
-        <w:t>Exception)</w:t>
+      <w:r>
+        <w:t>has(Exception)</w:t>
       </w:r>
     </w:p>
     <w:p/>

</xml_diff>